<commit_message>
style: enhance formatting and content organization in resume templates and personal notes
</commit_message>
<xml_diff>
--- a/build_targets/Level_0_Starter/Starter_Resume.docx
+++ b/build_targets/Level_0_Starter/Starter_Resume.docx
@@ -6,8 +6,10 @@
       <w:pPr>
         <w:pStyle w:val="Title"/>
         <w:ind w:left="0"/>
-        <w:rPr>
-          <w:rFonts w:ascii="Aptos" w:hAnsi="Aptos"/>
+        <w:jc w:val="center"/>
+        <w:rPr>
+          <w:rFonts w:ascii="Aptos" w:hAnsi="Aptos"/>
+          <w:color w:val="000080"/>
           <w:sz w:val="36"/>
           <w:szCs w:val="36"/>
         </w:rPr>
@@ -15,10 +17,88 @@
       <w:r>
         <w:rPr>
           <w:rFonts w:ascii="Aptos" w:hAnsi="Aptos"/>
+          <w:color w:val="000080"/>
           <w:sz w:val="36"/>
           <w:szCs w:val="36"/>
         </w:rPr>
         <w:t>[Full Name]</w:t>
+      </w:r>
+    </w:p>
+    <w:p>
+      <w:pPr>
+        <w:pStyle w:val="BodyText"/>
+        <w:pBdr>
+          <w:bottom w:val="single" w:sz="12" w:space="1" w:color="auto"/>
+        </w:pBdr>
+        <w:spacing w:line="278" w:lineRule="auto"/>
+        <w:ind w:left="0" w:right="27" w:firstLine="0"/>
+        <w:jc w:val="center"/>
+        <w:rPr>
+          <w:rFonts w:ascii="Aptos" w:hAnsi="Aptos"/>
+        </w:rPr>
+      </w:pPr>
+      <w:r>
+        <w:rPr>
+          <w:rFonts w:ascii="Aptos" w:hAnsi="Aptos"/>
+        </w:rPr>
+        <w:t>Regina,</w:t>
+      </w:r>
+      <w:r>
+        <w:rPr>
+          <w:rFonts w:ascii="Aptos" w:hAnsi="Aptos"/>
+          <w:spacing w:val="-3"/>
+        </w:rPr>
+        <w:t xml:space="preserve"> </w:t>
+      </w:r>
+      <w:r>
+        <w:rPr>
+          <w:rFonts w:ascii="Aptos" w:hAnsi="Aptos"/>
+        </w:rPr>
+        <w:t>S</w:t>
+      </w:r>
+      <w:r>
+        <w:rPr>
+          <w:rFonts w:ascii="Aptos" w:hAnsi="Aptos"/>
+        </w:rPr>
+        <w:t>K</w:t>
+      </w:r>
+      <w:r>
+        <w:rPr>
+          <w:rFonts w:ascii="Aptos" w:hAnsi="Aptos"/>
+          <w:spacing w:val="-3"/>
+        </w:rPr>
+        <w:t xml:space="preserve"> </w:t>
+      </w:r>
+      <w:r>
+        <w:rPr>
+          <w:rFonts w:ascii="Aptos" w:hAnsi="Aptos"/>
+        </w:rPr>
+        <w:t>|</w:t>
+      </w:r>
+      <w:r>
+        <w:rPr>
+          <w:rFonts w:ascii="Aptos" w:hAnsi="Aptos"/>
+          <w:spacing w:val="-3"/>
+        </w:rPr>
+        <w:t xml:space="preserve"> </w:t>
+      </w:r>
+      <w:r>
+        <w:rPr>
+          <w:rFonts w:ascii="Aptos" w:hAnsi="Aptos"/>
+          <w:spacing w:val="-3"/>
+        </w:rPr>
+        <w:t>[</w:t>
+      </w:r>
+      <w:r>
+        <w:t>Email Address] | [</w:t>
+      </w:r>
+      <w:proofErr w:type="spellStart"/>
+      <w:r>
+        <w:t>Linkedin</w:t>
+      </w:r>
+      <w:proofErr w:type="spellEnd"/>
+      <w:r>
+        <w:t xml:space="preserve"> Profile URL] | [GitHub Profile URL]</w:t>
       </w:r>
     </w:p>
     <w:p>
@@ -30,111 +110,237 @@
           <w:rFonts w:ascii="Aptos" w:hAnsi="Aptos"/>
         </w:rPr>
       </w:pPr>
-      <w:r>
-        <w:rPr>
-          <w:rFonts w:ascii="Aptos" w:hAnsi="Aptos"/>
-        </w:rPr>
-        <w:t>Regina,</w:t>
-      </w:r>
-      <w:r>
-        <w:rPr>
-          <w:rFonts w:ascii="Aptos" w:hAnsi="Aptos"/>
-          <w:spacing w:val="-3"/>
-        </w:rPr>
-        <w:t xml:space="preserve"> </w:t>
-      </w:r>
-      <w:r>
-        <w:rPr>
-          <w:rFonts w:ascii="Aptos" w:hAnsi="Aptos"/>
-        </w:rPr>
-        <w:t>S</w:t>
-      </w:r>
-      <w:r>
-        <w:rPr>
-          <w:rFonts w:ascii="Aptos" w:hAnsi="Aptos"/>
-        </w:rPr>
-        <w:t>K</w:t>
-      </w:r>
-      <w:r>
-        <w:rPr>
-          <w:rFonts w:ascii="Aptos" w:hAnsi="Aptos"/>
-          <w:spacing w:val="-3"/>
-        </w:rPr>
-        <w:t xml:space="preserve"> </w:t>
-      </w:r>
-      <w:r>
-        <w:rPr>
-          <w:rFonts w:ascii="Aptos" w:hAnsi="Aptos"/>
-        </w:rPr>
-        <w:t>|</w:t>
-      </w:r>
-      <w:r>
-        <w:rPr>
-          <w:rFonts w:ascii="Aptos" w:hAnsi="Aptos"/>
-          <w:spacing w:val="-3"/>
-        </w:rPr>
-        <w:t xml:space="preserve"> </w:t>
-      </w:r>
-      <w:r>
-        <w:rPr>
-          <w:rFonts w:ascii="Aptos" w:hAnsi="Aptos"/>
-          <w:spacing w:val="-3"/>
-        </w:rPr>
-        <w:t>[</w:t>
-      </w:r>
-      <w:r>
-        <w:t>Email Address] | [Linkedin Profile URL] | [GitHub Profile URL]</w:t>
-      </w:r>
     </w:p>
     <w:p>
       <w:pPr>
         <w:pStyle w:val="BodyText"/>
         <w:spacing w:line="278" w:lineRule="auto"/>
-        <w:ind w:left="0" w:right="1231" w:firstLine="0"/>
-        <w:rPr>
-          <w:rFonts w:ascii="Aptos" w:hAnsi="Aptos"/>
-        </w:rPr>
-      </w:pPr>
+        <w:ind w:left="0" w:right="27" w:firstLine="0"/>
+        <w:jc w:val="center"/>
+        <w:rPr>
+          <w:rFonts w:ascii="Aptos" w:hAnsi="Aptos"/>
+          <w:b/>
+          <w:bCs/>
+          <w:color w:val="000080"/>
+          <w:sz w:val="28"/>
+          <w:szCs w:val="28"/>
+        </w:rPr>
+      </w:pPr>
+      <w:r>
+        <w:rPr>
+          <w:rFonts w:ascii="Aptos" w:hAnsi="Aptos"/>
+          <w:b/>
+          <w:bCs/>
+          <w:color w:val="000080"/>
+          <w:sz w:val="28"/>
+          <w:szCs w:val="28"/>
+        </w:rPr>
+        <w:t>Professional Summary</w:t>
+      </w:r>
     </w:p>
     <w:p>
       <w:pPr>
-        <w:pStyle w:val="BodyText"/>
-        <w:spacing w:line="278" w:lineRule="auto"/>
-        <w:ind w:left="0" w:right="1231" w:firstLine="0"/>
-        <w:rPr>
-          <w:rFonts w:ascii="Aptos" w:hAnsi="Aptos"/>
-          <w:b/>
+        <w:pBdr>
+          <w:bottom w:val="single" w:sz="12" w:space="1" w:color="auto"/>
+        </w:pBdr>
+        <w:rPr>
+          <w:rFonts w:ascii="Aptos" w:hAnsi="Aptos"/>
           <w:bCs/>
-        </w:rPr>
-      </w:pPr>
-      <w:r>
-        <w:rPr>
-          <w:rFonts w:ascii="Aptos" w:hAnsi="Aptos"/>
-          <w:b/>
+          <w:spacing w:val="-2"/>
+          <w:sz w:val="24"/>
+          <w:szCs w:val="24"/>
+        </w:rPr>
+      </w:pPr>
+      <w:r>
+        <w:rPr>
+          <w:rFonts w:ascii="Aptos" w:hAnsi="Aptos"/>
           <w:bCs/>
-        </w:rPr>
-        <w:t>Professional Summary</w:t>
+          <w:spacing w:val="-2"/>
+          <w:sz w:val="24"/>
+          <w:szCs w:val="24"/>
+        </w:rPr>
+        <w:t>Second-year [Major] student with a strong foundation in [Core Skill 1] and [Core Skill 2]. Skilled in [Technical Skill from Coursework], [Transferable Skill], and adapting complex concepts for different audiences. Seeking a Co-op placement to apply [Specific Knowledge] and [Soft Skill] to support [Type of Team].</w:t>
       </w:r>
     </w:p>
     <w:p>
       <w:pPr>
         <w:rPr>
           <w:rFonts w:ascii="Aptos" w:hAnsi="Aptos"/>
-          <w:bCs/>
+          <w:b/>
           <w:spacing w:val="-2"/>
           <w:sz w:val="24"/>
           <w:szCs w:val="24"/>
         </w:rPr>
       </w:pPr>
-      <w:r>
-        <w:rPr>
-          <w:rFonts w:ascii="Aptos" w:hAnsi="Aptos"/>
-          <w:bCs/>
-          <w:spacing w:val="-2"/>
+    </w:p>
+    <w:p>
+      <w:pPr>
+        <w:jc w:val="center"/>
+        <w:rPr>
+          <w:rFonts w:ascii="Aptos" w:hAnsi="Aptos"/>
+          <w:b/>
+          <w:color w:val="000080"/>
+          <w:spacing w:val="-2"/>
+          <w:sz w:val="28"/>
+          <w:szCs w:val="28"/>
+        </w:rPr>
+      </w:pPr>
+      <w:r>
+        <w:rPr>
+          <w:rFonts w:ascii="Aptos" w:hAnsi="Aptos"/>
+          <w:b/>
+          <w:color w:val="000080"/>
+          <w:spacing w:val="-2"/>
+          <w:sz w:val="28"/>
+          <w:szCs w:val="28"/>
+        </w:rPr>
+        <w:t>Technical &amp; Professional Skills</w:t>
+      </w:r>
+    </w:p>
+    <w:p>
+      <w:pPr>
+        <w:pStyle w:val="Heading1"/>
+        <w:numPr>
+          <w:ilvl w:val="0"/>
+          <w:numId w:val="19"/>
+        </w:numPr>
+        <w:spacing w:line="240" w:lineRule="auto"/>
+        <w:rPr>
+          <w:rFonts w:ascii="Aptos" w:hAnsi="Aptos"/>
+          <w:b w:val="0"/>
+        </w:rPr>
+      </w:pPr>
+      <w:r>
+        <w:rPr>
+          <w:rFonts w:ascii="Aptos" w:hAnsi="Aptos"/>
+          <w:bCs w:val="0"/>
+        </w:rPr>
+        <w:t>Languages:</w:t>
+      </w:r>
+      <w:r>
+        <w:rPr>
+          <w:rFonts w:ascii="Aptos" w:hAnsi="Aptos"/>
+          <w:b w:val="0"/>
+        </w:rPr>
+        <w:t xml:space="preserve"> [languages like C++, Python, SQL, </w:t>
+      </w:r>
+      <w:proofErr w:type="spellStart"/>
+      <w:r>
+        <w:rPr>
+          <w:rFonts w:ascii="Aptos" w:hAnsi="Aptos"/>
+          <w:b w:val="0"/>
+        </w:rPr>
+        <w:t>etc</w:t>
+      </w:r>
+      <w:proofErr w:type="spellEnd"/>
+      <w:r>
+        <w:rPr>
+          <w:rFonts w:ascii="Aptos" w:hAnsi="Aptos"/>
+          <w:b w:val="0"/>
+        </w:rPr>
+        <w:t>]</w:t>
+      </w:r>
+    </w:p>
+    <w:p>
+      <w:pPr>
+        <w:pStyle w:val="Heading1"/>
+        <w:numPr>
+          <w:ilvl w:val="0"/>
+          <w:numId w:val="19"/>
+        </w:numPr>
+        <w:spacing w:line="240" w:lineRule="auto"/>
+        <w:rPr>
+          <w:rFonts w:ascii="Aptos" w:hAnsi="Aptos"/>
+          <w:b w:val="0"/>
+        </w:rPr>
+      </w:pPr>
+      <w:r>
+        <w:rPr>
+          <w:rFonts w:ascii="Aptos" w:hAnsi="Aptos"/>
+          <w:bCs w:val="0"/>
+        </w:rPr>
+        <w:t>Tools:</w:t>
+      </w:r>
+      <w:r>
+        <w:rPr>
+          <w:rFonts w:ascii="Aptos" w:hAnsi="Aptos"/>
+          <w:b w:val="0"/>
+        </w:rPr>
+        <w:t xml:space="preserve"> [tools like Git/GitHub, Linux, etc.]</w:t>
+      </w:r>
+    </w:p>
+    <w:p>
+      <w:pPr>
+        <w:pStyle w:val="Heading1"/>
+        <w:numPr>
+          <w:ilvl w:val="0"/>
+          <w:numId w:val="19"/>
+        </w:numPr>
+        <w:spacing w:line="240" w:lineRule="auto"/>
+        <w:rPr>
+          <w:rFonts w:ascii="Aptos" w:hAnsi="Aptos"/>
+          <w:b w:val="0"/>
+        </w:rPr>
+      </w:pPr>
+      <w:r>
+        <w:rPr>
+          <w:rFonts w:ascii="Aptos" w:hAnsi="Aptos"/>
+          <w:bCs w:val="0"/>
+        </w:rPr>
+        <w:t>Concepts:</w:t>
+      </w:r>
+      <w:r>
+        <w:rPr>
+          <w:rFonts w:ascii="Aptos" w:hAnsi="Aptos"/>
+          <w:b w:val="0"/>
+        </w:rPr>
+        <w:t xml:space="preserve"> [concepts like Object Oriented Programming, Relational Databases, etc.]</w:t>
+      </w:r>
+    </w:p>
+    <w:p>
+      <w:pPr>
+        <w:pStyle w:val="ListParagraph"/>
+        <w:numPr>
+          <w:ilvl w:val="0"/>
+          <w:numId w:val="35"/>
+        </w:numPr>
+        <w:pBdr>
+          <w:bottom w:val="single" w:sz="12" w:space="1" w:color="auto"/>
+        </w:pBdr>
+        <w:spacing w:line="240" w:lineRule="auto"/>
+        <w:rPr>
+          <w:rFonts w:ascii="Aptos" w:hAnsi="Aptos"/>
+          <w:b/>
           <w:sz w:val="24"/>
           <w:szCs w:val="24"/>
         </w:rPr>
-        <w:t>Second-year [Major] student with a strong foundation in [Core Skill 1] and [Core Skill 2]. Skilled in [Technical Skill from Coursework], [Transferable Skill], and adapting complex concepts for different audiences. Seeking a Co-op placement to apply [Specific Knowledge] and [Soft Skill] to support [Type of Team].</w:t>
+      </w:pPr>
+      <w:r>
+        <w:rPr>
+          <w:rFonts w:ascii="Aptos" w:hAnsi="Aptos"/>
+          <w:b/>
+          <w:sz w:val="24"/>
+          <w:szCs w:val="24"/>
+        </w:rPr>
+        <w:t>Professional Skills:</w:t>
+      </w:r>
+      <w:r>
+        <w:rPr>
+          <w:rFonts w:ascii="Aptos" w:hAnsi="Aptos"/>
+          <w:bCs/>
+          <w:sz w:val="24"/>
+          <w:szCs w:val="24"/>
+        </w:rPr>
+        <w:t xml:space="preserve"> </w:t>
+      </w:r>
+      <w:r>
+        <w:rPr>
+          <w:rFonts w:ascii="Aptos" w:hAnsi="Aptos"/>
+          <w:bCs/>
+          <w:sz w:val="24"/>
+          <w:szCs w:val="24"/>
+        </w:rPr>
+        <w:t>[4 to 5 professional skills in one bullet point based on job description and which you can prove]</w:t>
       </w:r>
     </w:p>
     <w:p>
@@ -150,21 +356,24 @@
     </w:p>
     <w:p>
       <w:pPr>
+        <w:jc w:val="center"/>
         <w:rPr>
           <w:rFonts w:ascii="Aptos" w:hAnsi="Aptos"/>
           <w:b/>
-          <w:spacing w:val="-2"/>
-          <w:sz w:val="24"/>
-          <w:szCs w:val="24"/>
+          <w:color w:val="000080"/>
+          <w:spacing w:val="-2"/>
+          <w:sz w:val="28"/>
+          <w:szCs w:val="28"/>
         </w:rPr>
       </w:pPr>
       <w:r>
         <w:rPr>
           <w:rFonts w:ascii="Aptos" w:hAnsi="Aptos"/>
           <w:b/>
-          <w:spacing w:val="-2"/>
-          <w:sz w:val="24"/>
-          <w:szCs w:val="24"/>
+          <w:color w:val="000080"/>
+          <w:spacing w:val="-2"/>
+          <w:sz w:val="28"/>
+          <w:szCs w:val="28"/>
         </w:rPr>
         <w:t>Education</w:t>
       </w:r>
@@ -334,6 +543,9 @@
           <w:ilvl w:val="0"/>
           <w:numId w:val="20"/>
         </w:numPr>
+        <w:pBdr>
+          <w:bottom w:val="single" w:sz="12" w:space="1" w:color="auto"/>
+        </w:pBdr>
         <w:rPr>
           <w:rFonts w:ascii="Aptos" w:hAnsi="Aptos"/>
           <w:bCs/>
@@ -350,27 +562,27 @@
           <w:sz w:val="24"/>
           <w:szCs w:val="24"/>
         </w:rPr>
-        <w:t>Awards:</w:t>
-      </w:r>
-      <w:r>
-        <w:rPr>
-          <w:rFonts w:ascii="Aptos" w:hAnsi="Aptos"/>
-          <w:bCs/>
+        <w:t>A</w:t>
+      </w:r>
+      <w:r>
+        <w:rPr>
+          <w:rFonts w:ascii="Aptos" w:hAnsi="Aptos"/>
+          <w:b/>
           <w:spacing w:val="-2"/>
           <w:sz w:val="24"/>
           <w:szCs w:val="24"/>
         </w:rPr>
-        <w:t xml:space="preserve"> </w:t>
-      </w:r>
-      <w:r>
-        <w:rPr>
-          <w:rFonts w:ascii="Aptos" w:hAnsi="Aptos"/>
-          <w:bCs/>
+        <w:t>cademic Honours</w:t>
+      </w:r>
+      <w:r>
+        <w:rPr>
+          <w:rFonts w:ascii="Aptos" w:hAnsi="Aptos"/>
+          <w:b/>
           <w:spacing w:val="-2"/>
           <w:sz w:val="24"/>
           <w:szCs w:val="24"/>
         </w:rPr>
-        <w:t>[</w:t>
+        <w:t>:</w:t>
       </w:r>
       <w:r>
         <w:rPr>
@@ -380,7 +592,7 @@
           <w:sz w:val="24"/>
           <w:szCs w:val="24"/>
         </w:rPr>
-        <w:t>Dean’s Honors Certificates (</w:t>
+        <w:t xml:space="preserve"> </w:t>
       </w:r>
       <w:r>
         <w:rPr>
@@ -390,7 +602,7 @@
           <w:sz w:val="24"/>
           <w:szCs w:val="24"/>
         </w:rPr>
-        <w:t>Month Year</w:t>
+        <w:t>[</w:t>
       </w:r>
       <w:r>
         <w:rPr>
@@ -400,7 +612,7 @@
           <w:sz w:val="24"/>
           <w:szCs w:val="24"/>
         </w:rPr>
-        <w:t>)</w:t>
+        <w:t>Dean’s Honors Certificates (</w:t>
       </w:r>
       <w:r>
         <w:rPr>
@@ -410,7 +622,7 @@
           <w:sz w:val="24"/>
           <w:szCs w:val="24"/>
         </w:rPr>
-        <w:t>]</w:t>
+        <w:t>Month Year</w:t>
       </w:r>
       <w:r>
         <w:rPr>
@@ -420,7 +632,7 @@
           <w:sz w:val="24"/>
           <w:szCs w:val="24"/>
         </w:rPr>
-        <w:t xml:space="preserve">, </w:t>
+        <w:t>)</w:t>
       </w:r>
       <w:r>
         <w:rPr>
@@ -430,7 +642,76 @@
           <w:sz w:val="24"/>
           <w:szCs w:val="24"/>
         </w:rPr>
+        <w:t>]</w:t>
+      </w:r>
+      <w:r>
+        <w:rPr>
+          <w:rFonts w:ascii="Aptos" w:hAnsi="Aptos"/>
+          <w:bCs/>
+          <w:spacing w:val="-2"/>
+          <w:sz w:val="24"/>
+          <w:szCs w:val="24"/>
+        </w:rPr>
+        <w:t xml:space="preserve">, </w:t>
+      </w:r>
+      <w:r>
+        <w:rPr>
+          <w:rFonts w:ascii="Aptos" w:hAnsi="Aptos"/>
+          <w:bCs/>
+          <w:spacing w:val="-2"/>
+          <w:sz w:val="24"/>
+          <w:szCs w:val="24"/>
+        </w:rPr>
         <w:t>[Scholarship or High School Award if recent]</w:t>
+      </w:r>
+    </w:p>
+    <w:p>
+      <w:pPr>
+        <w:pStyle w:val="ListParagraph"/>
+        <w:numPr>
+          <w:ilvl w:val="0"/>
+          <w:numId w:val="20"/>
+        </w:numPr>
+        <w:pBdr>
+          <w:bottom w:val="single" w:sz="12" w:space="1" w:color="auto"/>
+        </w:pBdr>
+        <w:rPr>
+          <w:rFonts w:ascii="Aptos" w:hAnsi="Aptos"/>
+          <w:b/>
+          <w:spacing w:val="-2"/>
+          <w:sz w:val="24"/>
+          <w:szCs w:val="24"/>
+        </w:rPr>
+      </w:pPr>
+      <w:r>
+        <w:rPr>
+          <w:rFonts w:ascii="Aptos" w:hAnsi="Aptos"/>
+          <w:b/>
+          <w:spacing w:val="-2"/>
+          <w:sz w:val="24"/>
+          <w:szCs w:val="24"/>
+        </w:rPr>
+        <w:t>Activities</w:t>
+      </w:r>
+      <w:r>
+        <w:rPr>
+          <w:rFonts w:ascii="Aptos" w:hAnsi="Aptos"/>
+          <w:b/>
+          <w:spacing w:val="-2"/>
+          <w:sz w:val="24"/>
+          <w:szCs w:val="24"/>
+        </w:rPr>
+        <w:t xml:space="preserve">: </w:t>
+      </w:r>
+      <w:r>
+        <w:rPr>
+          <w:rFonts w:ascii="Aptos" w:hAnsi="Aptos"/>
+          <w:bCs/>
+          <w:spacing w:val="-2"/>
+          <w:sz w:val="24"/>
+          <w:szCs w:val="24"/>
+        </w:rPr>
+        <w:t>[whether you participate in a club/community activity or volunteering at the university]</w:t>
       </w:r>
     </w:p>
     <w:p>
@@ -449,11 +730,15 @@
         <w:pStyle w:val="BodyText"/>
         <w:spacing w:before="49"/>
         <w:ind w:left="0" w:firstLine="0"/>
+        <w:jc w:val="center"/>
         <w:rPr>
           <w:rFonts w:ascii="Aptos" w:hAnsi="Aptos"/>
           <w:b/>
           <w:bCs/>
-          <w:spacing w:val="-2"/>
+          <w:color w:val="000080"/>
+          <w:spacing w:val="-2"/>
+          <w:sz w:val="28"/>
+          <w:szCs w:val="28"/>
         </w:rPr>
       </w:pPr>
       <w:r>
@@ -461,7 +746,10 @@
           <w:rFonts w:ascii="Aptos" w:hAnsi="Aptos"/>
           <w:b/>
           <w:bCs/>
-          <w:spacing w:val="-2"/>
+          <w:color w:val="000080"/>
+          <w:spacing w:val="-2"/>
+          <w:sz w:val="28"/>
+          <w:szCs w:val="28"/>
         </w:rPr>
         <w:t>Projects &amp; Research</w:t>
       </w:r>
@@ -470,9 +758,21 @@
           <w:rFonts w:ascii="Aptos" w:hAnsi="Aptos"/>
           <w:b/>
           <w:bCs/>
-          <w:spacing w:val="-2"/>
-        </w:rPr>
-        <w:t xml:space="preserve"> [</w:t>
+          <w:color w:val="000080"/>
+          <w:spacing w:val="-2"/>
+          <w:sz w:val="28"/>
+          <w:szCs w:val="28"/>
+        </w:rPr>
+        <w:br/>
+      </w:r>
+      <w:r>
+        <w:rPr>
+          <w:rFonts w:ascii="Aptos" w:hAnsi="Aptos"/>
+          <w:b/>
+          <w:bCs/>
+          <w:spacing w:val="-2"/>
+        </w:rPr>
+        <w:t>[</w:t>
       </w:r>
       <w:r>
         <w:rPr>
@@ -485,6 +785,7 @@
         </w:rPr>
         <w:t xml:space="preserve">Since you lack work experience, these are your "Jobs". Use the </w:t>
       </w:r>
+      <w:proofErr w:type="spellStart"/>
       <w:r>
         <w:rPr>
           <w:rFonts w:ascii="Aptos" w:hAnsi="Aptos"/>
@@ -496,6 +797,7 @@
         </w:rPr>
         <w:t>source_code</w:t>
       </w:r>
+      <w:proofErr w:type="spellEnd"/>
       <w:r>
         <w:rPr>
           <w:rFonts w:ascii="Aptos" w:hAnsi="Aptos"/>
@@ -643,6 +945,9 @@
           <w:ilvl w:val="0"/>
           <w:numId w:val="34"/>
         </w:numPr>
+        <w:pBdr>
+          <w:bottom w:val="single" w:sz="12" w:space="1" w:color="auto"/>
+        </w:pBdr>
         <w:spacing w:before="49"/>
         <w:rPr>
           <w:rFonts w:ascii="Aptos" w:hAnsi="Aptos"/>
@@ -673,15 +978,19 @@
         <w:pStyle w:val="Heading1"/>
         <w:spacing w:after="240" w:line="240" w:lineRule="auto"/>
         <w:ind w:left="0"/>
-        <w:rPr>
-          <w:rFonts w:ascii="Aptos" w:hAnsi="Aptos"/>
-          <w:spacing w:val="-2"/>
-        </w:rPr>
-      </w:pPr>
-      <w:r>
-        <w:rPr>
-          <w:rFonts w:ascii="Aptos" w:hAnsi="Aptos"/>
-          <w:spacing w:val="-2"/>
+        <w:jc w:val="center"/>
+        <w:rPr>
+          <w:rFonts w:ascii="Aptos" w:hAnsi="Aptos"/>
+          <w:spacing w:val="-2"/>
+        </w:rPr>
+      </w:pPr>
+      <w:r>
+        <w:rPr>
+          <w:rFonts w:ascii="Aptos" w:hAnsi="Aptos"/>
+          <w:color w:val="000080"/>
+          <w:spacing w:val="-2"/>
+          <w:sz w:val="28"/>
+          <w:szCs w:val="28"/>
         </w:rPr>
         <w:t>Experience</w:t>
       </w:r>
@@ -690,7 +999,14 @@
           <w:rFonts w:ascii="Aptos" w:hAnsi="Aptos"/>
           <w:spacing w:val="-2"/>
         </w:rPr>
-        <w:t xml:space="preserve"> [</w:t>
+        <w:br/>
+      </w:r>
+      <w:r>
+        <w:rPr>
+          <w:rFonts w:ascii="Aptos" w:hAnsi="Aptos"/>
+          <w:spacing w:val="-2"/>
+        </w:rPr>
+        <w:t>[</w:t>
       </w:r>
       <w:r>
         <w:rPr>
@@ -757,7 +1073,17 @@
           <w:bCs w:val="0"/>
           <w:spacing w:val="-2"/>
         </w:rPr>
-        <w:t>Prioritized task execution in a high-concurrency environment, managing [Number] active tables/clients simultaneously</w:t>
+        <w:t xml:space="preserve">Prioritized task execution in a high-concurrency environment, managing [Number] active tables/clients </w:t>
+      </w:r>
+      <w:r>
+        <w:rPr>
+          <w:rFonts w:ascii="Aptos" w:hAnsi="Aptos"/>
+          <w:b w:val="0"/>
+          <w:bCs w:val="0"/>
+          <w:spacing w:val="-2"/>
+        </w:rPr>
+        <w:lastRenderedPageBreak/>
+        <w:t>simultaneously</w:t>
       </w:r>
       <w:r>
         <w:rPr>
@@ -883,7 +1209,6 @@
           <w:numId w:val="30"/>
         </w:numPr>
         <w:spacing w:line="240" w:lineRule="auto"/>
-        <w:ind w:left="820"/>
         <w:rPr>
           <w:rFonts w:ascii="Aptos" w:hAnsi="Aptos"/>
           <w:b w:val="0"/>
@@ -916,8 +1241,10 @@
           <w:ilvl w:val="0"/>
           <w:numId w:val="30"/>
         </w:numPr>
+        <w:pBdr>
+          <w:bottom w:val="single" w:sz="12" w:space="1" w:color="auto"/>
+        </w:pBdr>
         <w:spacing w:line="240" w:lineRule="auto"/>
-        <w:ind w:left="820"/>
         <w:rPr>
           <w:rFonts w:ascii="Aptos" w:hAnsi="Aptos"/>
           <w:b w:val="0"/>
@@ -944,147 +1271,14 @@
     <w:p>
       <w:pPr>
         <w:pStyle w:val="Heading1"/>
-        <w:spacing w:before="240"/>
+        <w:spacing w:line="240" w:lineRule="auto"/>
         <w:ind w:left="0"/>
         <w:rPr>
           <w:rFonts w:ascii="Aptos" w:hAnsi="Aptos"/>
-          <w:spacing w:val="-2"/>
-        </w:rPr>
-      </w:pPr>
-      <w:r>
-        <w:rPr>
-          <w:rFonts w:ascii="Aptos" w:hAnsi="Aptos"/>
-          <w:spacing w:val="-2"/>
-        </w:rPr>
-        <w:t>Technical Skills</w:t>
-      </w:r>
-    </w:p>
-    <w:p>
-      <w:pPr>
-        <w:pStyle w:val="Heading1"/>
-        <w:numPr>
-          <w:ilvl w:val="0"/>
-          <w:numId w:val="19"/>
-        </w:numPr>
-        <w:spacing w:line="240" w:lineRule="auto"/>
-        <w:rPr>
-          <w:rFonts w:ascii="Aptos" w:hAnsi="Aptos"/>
           <w:b w:val="0"/>
-        </w:rPr>
-      </w:pPr>
-      <w:r>
-        <w:rPr>
-          <w:rFonts w:ascii="Aptos" w:hAnsi="Aptos"/>
-          <w:b w:val="0"/>
-        </w:rPr>
-        <w:t>Languages:</w:t>
-      </w:r>
-      <w:r>
-        <w:rPr>
-          <w:rFonts w:ascii="Aptos" w:hAnsi="Aptos"/>
-          <w:b w:val="0"/>
-        </w:rPr>
-        <w:t xml:space="preserve"> [languages like C++, Python, SQL, etc]</w:t>
-      </w:r>
-    </w:p>
-    <w:p>
-      <w:pPr>
-        <w:pStyle w:val="Heading1"/>
-        <w:numPr>
-          <w:ilvl w:val="0"/>
-          <w:numId w:val="19"/>
-        </w:numPr>
-        <w:spacing w:line="240" w:lineRule="auto"/>
-        <w:rPr>
-          <w:rFonts w:ascii="Aptos" w:hAnsi="Aptos"/>
-          <w:b w:val="0"/>
-        </w:rPr>
-      </w:pPr>
-      <w:r>
-        <w:rPr>
-          <w:rFonts w:ascii="Aptos" w:hAnsi="Aptos"/>
-          <w:b w:val="0"/>
-        </w:rPr>
-        <w:lastRenderedPageBreak/>
-        <w:t>Tools: [tools like Git/GitHub, Linux, etc.]</w:t>
-      </w:r>
-    </w:p>
-    <w:p>
-      <w:pPr>
-        <w:pStyle w:val="Heading1"/>
-        <w:numPr>
-          <w:ilvl w:val="0"/>
-          <w:numId w:val="19"/>
-        </w:numPr>
-        <w:spacing w:line="240" w:lineRule="auto"/>
-        <w:rPr>
-          <w:rFonts w:ascii="Aptos" w:hAnsi="Aptos"/>
-          <w:b w:val="0"/>
-        </w:rPr>
-      </w:pPr>
-      <w:r>
-        <w:rPr>
-          <w:rFonts w:ascii="Aptos" w:hAnsi="Aptos"/>
-          <w:b w:val="0"/>
-        </w:rPr>
-        <w:t>Concepts: [concepts like Object Oriented Programming, Relational Databases, etc.]</w:t>
-      </w:r>
-    </w:p>
-    <w:p>
-      <w:pPr>
-        <w:pStyle w:val="Heading1"/>
-        <w:spacing w:line="240" w:lineRule="auto"/>
-        <w:ind w:left="820"/>
-        <w:rPr>
-          <w:rFonts w:ascii="Aptos" w:hAnsi="Aptos"/>
-          <w:b w:val="0"/>
-        </w:rPr>
-      </w:pPr>
-    </w:p>
-    <w:p>
-      <w:pPr>
-        <w:pStyle w:val="BodyText"/>
-        <w:spacing w:before="49"/>
-        <w:ind w:left="0" w:firstLine="0"/>
-        <w:rPr>
-          <w:rFonts w:ascii="Aptos" w:hAnsi="Aptos"/>
-          <w:b/>
-          <w:bCs/>
-        </w:rPr>
-      </w:pPr>
-      <w:r>
-        <w:rPr>
-          <w:rFonts w:ascii="Aptos" w:hAnsi="Aptos"/>
-          <w:b/>
-          <w:bCs/>
-        </w:rPr>
-        <w:t>Professional Skills</w:t>
-      </w:r>
-    </w:p>
-    <w:p>
-      <w:pPr>
-        <w:pStyle w:val="ListParagraph"/>
-        <w:numPr>
-          <w:ilvl w:val="0"/>
-          <w:numId w:val="19"/>
-        </w:numPr>
-        <w:spacing w:line="240" w:lineRule="auto"/>
-        <w:rPr>
-          <w:rFonts w:ascii="Aptos" w:hAnsi="Aptos"/>
-          <w:b/>
-          <w:sz w:val="24"/>
-          <w:szCs w:val="24"/>
-        </w:rPr>
-      </w:pPr>
-      <w:r>
-        <w:rPr>
-          <w:rFonts w:ascii="Aptos" w:hAnsi="Aptos"/>
-          <w:bCs/>
-          <w:sz w:val="24"/>
-          <w:szCs w:val="24"/>
-        </w:rPr>
-        <w:t>[4 to 5 professional skills based on job description and which you can prove]</w:t>
-      </w:r>
+          <w:bCs w:val="0"/>
+        </w:rPr>
+      </w:pPr>
     </w:p>
     <w:sectPr>
       <w:pgSz w:w="12240" w:h="15840"/>
@@ -1108,7 +1302,7 @@
       <w:lvlText w:val=""/>
       <w:lvlJc w:val="left"/>
       <w:pPr>
-        <w:ind w:left="720" w:hanging="360"/>
+        <w:ind w:left="360" w:hanging="360"/>
       </w:pPr>
       <w:rPr>
         <w:rFonts w:ascii="Symbol" w:hAnsi="Symbol" w:hint="default"/>
@@ -1120,7 +1314,7 @@
       <w:lvlText w:val="o"/>
       <w:lvlJc w:val="left"/>
       <w:pPr>
-        <w:ind w:left="1440" w:hanging="360"/>
+        <w:ind w:left="1080" w:hanging="360"/>
       </w:pPr>
       <w:rPr>
         <w:rFonts w:ascii="Courier New" w:hAnsi="Courier New" w:cs="Courier New" w:hint="default"/>
@@ -1132,7 +1326,7 @@
       <w:lvlText w:val=""/>
       <w:lvlJc w:val="left"/>
       <w:pPr>
-        <w:ind w:left="2160" w:hanging="360"/>
+        <w:ind w:left="1800" w:hanging="360"/>
       </w:pPr>
       <w:rPr>
         <w:rFonts w:ascii="Wingdings" w:hAnsi="Wingdings" w:hint="default"/>
@@ -1144,7 +1338,7 @@
       <w:lvlText w:val=""/>
       <w:lvlJc w:val="left"/>
       <w:pPr>
-        <w:ind w:left="2880" w:hanging="360"/>
+        <w:ind w:left="2520" w:hanging="360"/>
       </w:pPr>
       <w:rPr>
         <w:rFonts w:ascii="Symbol" w:hAnsi="Symbol" w:hint="default"/>
@@ -1156,7 +1350,7 @@
       <w:lvlText w:val="o"/>
       <w:lvlJc w:val="left"/>
       <w:pPr>
-        <w:ind w:left="3600" w:hanging="360"/>
+        <w:ind w:left="3240" w:hanging="360"/>
       </w:pPr>
       <w:rPr>
         <w:rFonts w:ascii="Courier New" w:hAnsi="Courier New" w:cs="Courier New" w:hint="default"/>
@@ -1168,7 +1362,7 @@
       <w:lvlText w:val=""/>
       <w:lvlJc w:val="left"/>
       <w:pPr>
-        <w:ind w:left="4320" w:hanging="360"/>
+        <w:ind w:left="3960" w:hanging="360"/>
       </w:pPr>
       <w:rPr>
         <w:rFonts w:ascii="Wingdings" w:hAnsi="Wingdings" w:hint="default"/>
@@ -1180,7 +1374,7 @@
       <w:lvlText w:val=""/>
       <w:lvlJc w:val="left"/>
       <w:pPr>
-        <w:ind w:left="5040" w:hanging="360"/>
+        <w:ind w:left="4680" w:hanging="360"/>
       </w:pPr>
       <w:rPr>
         <w:rFonts w:ascii="Symbol" w:hAnsi="Symbol" w:hint="default"/>
@@ -1192,7 +1386,7 @@
       <w:lvlText w:val="o"/>
       <w:lvlJc w:val="left"/>
       <w:pPr>
-        <w:ind w:left="5760" w:hanging="360"/>
+        <w:ind w:left="5400" w:hanging="360"/>
       </w:pPr>
       <w:rPr>
         <w:rFonts w:ascii="Courier New" w:hAnsi="Courier New" w:cs="Courier New" w:hint="default"/>
@@ -1204,7 +1398,7 @@
       <w:lvlText w:val=""/>
       <w:lvlJc w:val="left"/>
       <w:pPr>
-        <w:ind w:left="6480" w:hanging="360"/>
+        <w:ind w:left="6120" w:hanging="360"/>
       </w:pPr>
       <w:rPr>
         <w:rFonts w:ascii="Wingdings" w:hAnsi="Wingdings" w:hint="default"/>
@@ -1673,7 +1867,7 @@
       <w:lvlText w:val=""/>
       <w:lvlJc w:val="left"/>
       <w:pPr>
-        <w:ind w:left="720" w:hanging="360"/>
+        <w:ind w:left="360" w:hanging="360"/>
       </w:pPr>
       <w:rPr>
         <w:rFonts w:ascii="Symbol" w:hAnsi="Symbol" w:hint="default"/>
@@ -1685,7 +1879,7 @@
       <w:lvlText w:val="o"/>
       <w:lvlJc w:val="left"/>
       <w:pPr>
-        <w:ind w:left="1440" w:hanging="360"/>
+        <w:ind w:left="1080" w:hanging="360"/>
       </w:pPr>
       <w:rPr>
         <w:rFonts w:ascii="Courier New" w:hAnsi="Courier New" w:cs="Courier New" w:hint="default"/>
@@ -1697,7 +1891,7 @@
       <w:lvlText w:val=""/>
       <w:lvlJc w:val="left"/>
       <w:pPr>
-        <w:ind w:left="2160" w:hanging="360"/>
+        <w:ind w:left="1800" w:hanging="360"/>
       </w:pPr>
       <w:rPr>
         <w:rFonts w:ascii="Wingdings" w:hAnsi="Wingdings" w:hint="default"/>
@@ -1709,7 +1903,7 @@
       <w:lvlText w:val=""/>
       <w:lvlJc w:val="left"/>
       <w:pPr>
-        <w:ind w:left="2880" w:hanging="360"/>
+        <w:ind w:left="2520" w:hanging="360"/>
       </w:pPr>
       <w:rPr>
         <w:rFonts w:ascii="Symbol" w:hAnsi="Symbol" w:hint="default"/>
@@ -1721,7 +1915,7 @@
       <w:lvlText w:val="o"/>
       <w:lvlJc w:val="left"/>
       <w:pPr>
-        <w:ind w:left="3600" w:hanging="360"/>
+        <w:ind w:left="3240" w:hanging="360"/>
       </w:pPr>
       <w:rPr>
         <w:rFonts w:ascii="Courier New" w:hAnsi="Courier New" w:cs="Courier New" w:hint="default"/>
@@ -1733,7 +1927,7 @@
       <w:lvlText w:val=""/>
       <w:lvlJc w:val="left"/>
       <w:pPr>
-        <w:ind w:left="4320" w:hanging="360"/>
+        <w:ind w:left="3960" w:hanging="360"/>
       </w:pPr>
       <w:rPr>
         <w:rFonts w:ascii="Wingdings" w:hAnsi="Wingdings" w:hint="default"/>
@@ -1745,7 +1939,7 @@
       <w:lvlText w:val=""/>
       <w:lvlJc w:val="left"/>
       <w:pPr>
-        <w:ind w:left="5040" w:hanging="360"/>
+        <w:ind w:left="4680" w:hanging="360"/>
       </w:pPr>
       <w:rPr>
         <w:rFonts w:ascii="Symbol" w:hAnsi="Symbol" w:hint="default"/>
@@ -1757,7 +1951,7 @@
       <w:lvlText w:val="o"/>
       <w:lvlJc w:val="left"/>
       <w:pPr>
-        <w:ind w:left="5760" w:hanging="360"/>
+        <w:ind w:left="5400" w:hanging="360"/>
       </w:pPr>
       <w:rPr>
         <w:rFonts w:ascii="Courier New" w:hAnsi="Courier New" w:cs="Courier New" w:hint="default"/>
@@ -1769,7 +1963,7 @@
       <w:lvlText w:val=""/>
       <w:lvlJc w:val="left"/>
       <w:pPr>
-        <w:ind w:left="6480" w:hanging="360"/>
+        <w:ind w:left="6120" w:hanging="360"/>
       </w:pPr>
       <w:rPr>
         <w:rFonts w:ascii="Wingdings" w:hAnsi="Wingdings" w:hint="default"/>
@@ -1898,6 +2092,119 @@
     </w:lvl>
   </w:abstractNum>
   <w:abstractNum w:abstractNumId="7" w15:restartNumberingAfterBreak="0">
+    <w:nsid w:val="0C9729F8"/>
+    <w:multiLevelType w:val="hybridMultilevel"/>
+    <w:tmpl w:val="81867B9E"/>
+    <w:lvl w:ilvl="0" w:tplc="10090001">
+      <w:start w:val="1"/>
+      <w:numFmt w:val="bullet"/>
+      <w:lvlText w:val=""/>
+      <w:lvlJc w:val="left"/>
+      <w:pPr>
+        <w:ind w:left="360" w:hanging="360"/>
+      </w:pPr>
+      <w:rPr>
+        <w:rFonts w:ascii="Symbol" w:hAnsi="Symbol" w:hint="default"/>
+      </w:rPr>
+    </w:lvl>
+    <w:lvl w:ilvl="1" w:tplc="10090003" w:tentative="1">
+      <w:start w:val="1"/>
+      <w:numFmt w:val="bullet"/>
+      <w:lvlText w:val="o"/>
+      <w:lvlJc w:val="left"/>
+      <w:pPr>
+        <w:ind w:left="1080" w:hanging="360"/>
+      </w:pPr>
+      <w:rPr>
+        <w:rFonts w:ascii="Courier New" w:hAnsi="Courier New" w:cs="Courier New" w:hint="default"/>
+      </w:rPr>
+    </w:lvl>
+    <w:lvl w:ilvl="2" w:tplc="10090005" w:tentative="1">
+      <w:start w:val="1"/>
+      <w:numFmt w:val="bullet"/>
+      <w:lvlText w:val=""/>
+      <w:lvlJc w:val="left"/>
+      <w:pPr>
+        <w:ind w:left="1800" w:hanging="360"/>
+      </w:pPr>
+      <w:rPr>
+        <w:rFonts w:ascii="Wingdings" w:hAnsi="Wingdings" w:hint="default"/>
+      </w:rPr>
+    </w:lvl>
+    <w:lvl w:ilvl="3" w:tplc="10090001" w:tentative="1">
+      <w:start w:val="1"/>
+      <w:numFmt w:val="bullet"/>
+      <w:lvlText w:val=""/>
+      <w:lvlJc w:val="left"/>
+      <w:pPr>
+        <w:ind w:left="2520" w:hanging="360"/>
+      </w:pPr>
+      <w:rPr>
+        <w:rFonts w:ascii="Symbol" w:hAnsi="Symbol" w:hint="default"/>
+      </w:rPr>
+    </w:lvl>
+    <w:lvl w:ilvl="4" w:tplc="10090003" w:tentative="1">
+      <w:start w:val="1"/>
+      <w:numFmt w:val="bullet"/>
+      <w:lvlText w:val="o"/>
+      <w:lvlJc w:val="left"/>
+      <w:pPr>
+        <w:ind w:left="3240" w:hanging="360"/>
+      </w:pPr>
+      <w:rPr>
+        <w:rFonts w:ascii="Courier New" w:hAnsi="Courier New" w:cs="Courier New" w:hint="default"/>
+      </w:rPr>
+    </w:lvl>
+    <w:lvl w:ilvl="5" w:tplc="10090005" w:tentative="1">
+      <w:start w:val="1"/>
+      <w:numFmt w:val="bullet"/>
+      <w:lvlText w:val=""/>
+      <w:lvlJc w:val="left"/>
+      <w:pPr>
+        <w:ind w:left="3960" w:hanging="360"/>
+      </w:pPr>
+      <w:rPr>
+        <w:rFonts w:ascii="Wingdings" w:hAnsi="Wingdings" w:hint="default"/>
+      </w:rPr>
+    </w:lvl>
+    <w:lvl w:ilvl="6" w:tplc="10090001" w:tentative="1">
+      <w:start w:val="1"/>
+      <w:numFmt w:val="bullet"/>
+      <w:lvlText w:val=""/>
+      <w:lvlJc w:val="left"/>
+      <w:pPr>
+        <w:ind w:left="4680" w:hanging="360"/>
+      </w:pPr>
+      <w:rPr>
+        <w:rFonts w:ascii="Symbol" w:hAnsi="Symbol" w:hint="default"/>
+      </w:rPr>
+    </w:lvl>
+    <w:lvl w:ilvl="7" w:tplc="10090003" w:tentative="1">
+      <w:start w:val="1"/>
+      <w:numFmt w:val="bullet"/>
+      <w:lvlText w:val="o"/>
+      <w:lvlJc w:val="left"/>
+      <w:pPr>
+        <w:ind w:left="5400" w:hanging="360"/>
+      </w:pPr>
+      <w:rPr>
+        <w:rFonts w:ascii="Courier New" w:hAnsi="Courier New" w:cs="Courier New" w:hint="default"/>
+      </w:rPr>
+    </w:lvl>
+    <w:lvl w:ilvl="8" w:tplc="10090005" w:tentative="1">
+      <w:start w:val="1"/>
+      <w:numFmt w:val="bullet"/>
+      <w:lvlText w:val=""/>
+      <w:lvlJc w:val="left"/>
+      <w:pPr>
+        <w:ind w:left="6120" w:hanging="360"/>
+      </w:pPr>
+      <w:rPr>
+        <w:rFonts w:ascii="Wingdings" w:hAnsi="Wingdings" w:hint="default"/>
+      </w:rPr>
+    </w:lvl>
+  </w:abstractNum>
+  <w:abstractNum w:abstractNumId="8" w15:restartNumberingAfterBreak="0">
     <w:nsid w:val="0DC6094F"/>
     <w:multiLevelType w:val="hybridMultilevel"/>
     <w:tmpl w:val="98D6BFFC"/>
@@ -2018,7 +2325,7 @@
       </w:rPr>
     </w:lvl>
   </w:abstractNum>
-  <w:abstractNum w:abstractNumId="8" w15:restartNumberingAfterBreak="0">
+  <w:abstractNum w:abstractNumId="9" w15:restartNumberingAfterBreak="0">
     <w:nsid w:val="159A67F1"/>
     <w:multiLevelType w:val="hybridMultilevel"/>
     <w:tmpl w:val="9B8E2598"/>
@@ -2131,7 +2438,7 @@
       </w:rPr>
     </w:lvl>
   </w:abstractNum>
-  <w:abstractNum w:abstractNumId="9" w15:restartNumberingAfterBreak="0">
+  <w:abstractNum w:abstractNumId="10" w15:restartNumberingAfterBreak="0">
     <w:nsid w:val="15FB016E"/>
     <w:multiLevelType w:val="hybridMultilevel"/>
     <w:tmpl w:val="2F1253B0"/>
@@ -2252,7 +2559,7 @@
       </w:rPr>
     </w:lvl>
   </w:abstractNum>
-  <w:abstractNum w:abstractNumId="10" w15:restartNumberingAfterBreak="0">
+  <w:abstractNum w:abstractNumId="11" w15:restartNumberingAfterBreak="0">
     <w:nsid w:val="265F46E2"/>
     <w:multiLevelType w:val="hybridMultilevel"/>
     <w:tmpl w:val="0D54C54A"/>
@@ -2262,7 +2569,7 @@
       <w:lvlText w:val=""/>
       <w:lvlJc w:val="left"/>
       <w:pPr>
-        <w:ind w:left="820" w:hanging="360"/>
+        <w:ind w:left="360" w:hanging="360"/>
       </w:pPr>
       <w:rPr>
         <w:rFonts w:ascii="Symbol" w:hAnsi="Symbol" w:hint="default"/>
@@ -2274,7 +2581,7 @@
       <w:lvlText w:val="o"/>
       <w:lvlJc w:val="left"/>
       <w:pPr>
-        <w:ind w:left="1540" w:hanging="360"/>
+        <w:ind w:left="1080" w:hanging="360"/>
       </w:pPr>
       <w:rPr>
         <w:rFonts w:ascii="Courier New" w:hAnsi="Courier New" w:cs="Courier New" w:hint="default"/>
@@ -2286,7 +2593,7 @@
       <w:lvlText w:val=""/>
       <w:lvlJc w:val="left"/>
       <w:pPr>
-        <w:ind w:left="2260" w:hanging="360"/>
+        <w:ind w:left="1800" w:hanging="360"/>
       </w:pPr>
       <w:rPr>
         <w:rFonts w:ascii="Wingdings" w:hAnsi="Wingdings" w:hint="default"/>
@@ -2298,7 +2605,7 @@
       <w:lvlText w:val=""/>
       <w:lvlJc w:val="left"/>
       <w:pPr>
-        <w:ind w:left="2980" w:hanging="360"/>
+        <w:ind w:left="2520" w:hanging="360"/>
       </w:pPr>
       <w:rPr>
         <w:rFonts w:ascii="Symbol" w:hAnsi="Symbol" w:hint="default"/>
@@ -2310,7 +2617,7 @@
       <w:lvlText w:val="o"/>
       <w:lvlJc w:val="left"/>
       <w:pPr>
-        <w:ind w:left="3700" w:hanging="360"/>
+        <w:ind w:left="3240" w:hanging="360"/>
       </w:pPr>
       <w:rPr>
         <w:rFonts w:ascii="Courier New" w:hAnsi="Courier New" w:cs="Courier New" w:hint="default"/>
@@ -2322,7 +2629,7 @@
       <w:lvlText w:val=""/>
       <w:lvlJc w:val="left"/>
       <w:pPr>
-        <w:ind w:left="4420" w:hanging="360"/>
+        <w:ind w:left="3960" w:hanging="360"/>
       </w:pPr>
       <w:rPr>
         <w:rFonts w:ascii="Wingdings" w:hAnsi="Wingdings" w:hint="default"/>
@@ -2334,7 +2641,7 @@
       <w:lvlText w:val=""/>
       <w:lvlJc w:val="left"/>
       <w:pPr>
-        <w:ind w:left="5140" w:hanging="360"/>
+        <w:ind w:left="4680" w:hanging="360"/>
       </w:pPr>
       <w:rPr>
         <w:rFonts w:ascii="Symbol" w:hAnsi="Symbol" w:hint="default"/>
@@ -2346,7 +2653,7 @@
       <w:lvlText w:val="o"/>
       <w:lvlJc w:val="left"/>
       <w:pPr>
-        <w:ind w:left="5860" w:hanging="360"/>
+        <w:ind w:left="5400" w:hanging="360"/>
       </w:pPr>
       <w:rPr>
         <w:rFonts w:ascii="Courier New" w:hAnsi="Courier New" w:cs="Courier New" w:hint="default"/>
@@ -2358,14 +2665,14 @@
       <w:lvlText w:val=""/>
       <w:lvlJc w:val="left"/>
       <w:pPr>
-        <w:ind w:left="6580" w:hanging="360"/>
+        <w:ind w:left="6120" w:hanging="360"/>
       </w:pPr>
       <w:rPr>
         <w:rFonts w:ascii="Wingdings" w:hAnsi="Wingdings" w:hint="default"/>
       </w:rPr>
     </w:lvl>
   </w:abstractNum>
-  <w:abstractNum w:abstractNumId="11" w15:restartNumberingAfterBreak="0">
+  <w:abstractNum w:abstractNumId="12" w15:restartNumberingAfterBreak="0">
     <w:nsid w:val="2A3911DE"/>
     <w:multiLevelType w:val="hybridMultilevel"/>
     <w:tmpl w:val="507AD306"/>
@@ -2478,7 +2785,7 @@
       </w:rPr>
     </w:lvl>
   </w:abstractNum>
-  <w:abstractNum w:abstractNumId="12" w15:restartNumberingAfterBreak="0">
+  <w:abstractNum w:abstractNumId="13" w15:restartNumberingAfterBreak="0">
     <w:nsid w:val="2A6D56EB"/>
     <w:multiLevelType w:val="hybridMultilevel"/>
     <w:tmpl w:val="732CECDE"/>
@@ -2591,7 +2898,7 @@
       </w:rPr>
     </w:lvl>
   </w:abstractNum>
-  <w:abstractNum w:abstractNumId="13" w15:restartNumberingAfterBreak="0">
+  <w:abstractNum w:abstractNumId="14" w15:restartNumberingAfterBreak="0">
     <w:nsid w:val="2CDD4E4A"/>
     <w:multiLevelType w:val="hybridMultilevel"/>
     <w:tmpl w:val="0F0A6E44"/>
@@ -2704,7 +3011,7 @@
       </w:rPr>
     </w:lvl>
   </w:abstractNum>
-  <w:abstractNum w:abstractNumId="14" w15:restartNumberingAfterBreak="0">
+  <w:abstractNum w:abstractNumId="15" w15:restartNumberingAfterBreak="0">
     <w:nsid w:val="3A8006DA"/>
     <w:multiLevelType w:val="hybridMultilevel"/>
     <w:tmpl w:val="552C111A"/>
@@ -2817,7 +3124,7 @@
       </w:rPr>
     </w:lvl>
   </w:abstractNum>
-  <w:abstractNum w:abstractNumId="15" w15:restartNumberingAfterBreak="0">
+  <w:abstractNum w:abstractNumId="16" w15:restartNumberingAfterBreak="0">
     <w:nsid w:val="424D5010"/>
     <w:multiLevelType w:val="hybridMultilevel"/>
     <w:tmpl w:val="DB282A04"/>
@@ -2930,7 +3237,7 @@
       </w:rPr>
     </w:lvl>
   </w:abstractNum>
-  <w:abstractNum w:abstractNumId="16" w15:restartNumberingAfterBreak="0">
+  <w:abstractNum w:abstractNumId="17" w15:restartNumberingAfterBreak="0">
     <w:nsid w:val="44FA795B"/>
     <w:multiLevelType w:val="hybridMultilevel"/>
     <w:tmpl w:val="CCA4243E"/>
@@ -3043,7 +3350,7 @@
       </w:rPr>
     </w:lvl>
   </w:abstractNum>
-  <w:abstractNum w:abstractNumId="17" w15:restartNumberingAfterBreak="0">
+  <w:abstractNum w:abstractNumId="18" w15:restartNumberingAfterBreak="0">
     <w:nsid w:val="45F6212C"/>
     <w:multiLevelType w:val="hybridMultilevel"/>
     <w:tmpl w:val="9560FDF4"/>
@@ -3164,7 +3471,7 @@
       </w:rPr>
     </w:lvl>
   </w:abstractNum>
-  <w:abstractNum w:abstractNumId="18" w15:restartNumberingAfterBreak="0">
+  <w:abstractNum w:abstractNumId="19" w15:restartNumberingAfterBreak="0">
     <w:nsid w:val="461011C7"/>
     <w:multiLevelType w:val="hybridMultilevel"/>
     <w:tmpl w:val="55D8BC34"/>
@@ -3277,7 +3584,7 @@
       </w:rPr>
     </w:lvl>
   </w:abstractNum>
-  <w:abstractNum w:abstractNumId="19" w15:restartNumberingAfterBreak="0">
+  <w:abstractNum w:abstractNumId="20" w15:restartNumberingAfterBreak="0">
     <w:nsid w:val="46BF5935"/>
     <w:multiLevelType w:val="hybridMultilevel"/>
     <w:tmpl w:val="726C3442"/>
@@ -3390,7 +3697,7 @@
       </w:rPr>
     </w:lvl>
   </w:abstractNum>
-  <w:abstractNum w:abstractNumId="20" w15:restartNumberingAfterBreak="0">
+  <w:abstractNum w:abstractNumId="21" w15:restartNumberingAfterBreak="0">
     <w:nsid w:val="4A247ABB"/>
     <w:multiLevelType w:val="hybridMultilevel"/>
     <w:tmpl w:val="78F0F452"/>
@@ -3503,7 +3810,7 @@
       </w:rPr>
     </w:lvl>
   </w:abstractNum>
-  <w:abstractNum w:abstractNumId="21" w15:restartNumberingAfterBreak="0">
+  <w:abstractNum w:abstractNumId="22" w15:restartNumberingAfterBreak="0">
     <w:nsid w:val="4C9831DF"/>
     <w:multiLevelType w:val="hybridMultilevel"/>
     <w:tmpl w:val="C58E8258"/>
@@ -3616,7 +3923,7 @@
       </w:rPr>
     </w:lvl>
   </w:abstractNum>
-  <w:abstractNum w:abstractNumId="22" w15:restartNumberingAfterBreak="0">
+  <w:abstractNum w:abstractNumId="23" w15:restartNumberingAfterBreak="0">
     <w:nsid w:val="4C9A074D"/>
     <w:multiLevelType w:val="hybridMultilevel"/>
     <w:tmpl w:val="6AACD1AC"/>
@@ -3729,7 +4036,7 @@
       </w:rPr>
     </w:lvl>
   </w:abstractNum>
-  <w:abstractNum w:abstractNumId="23" w15:restartNumberingAfterBreak="0">
+  <w:abstractNum w:abstractNumId="24" w15:restartNumberingAfterBreak="0">
     <w:nsid w:val="4D5038BC"/>
     <w:multiLevelType w:val="hybridMultilevel"/>
     <w:tmpl w:val="67743778"/>
@@ -3842,7 +4149,7 @@
       </w:rPr>
     </w:lvl>
   </w:abstractNum>
-  <w:abstractNum w:abstractNumId="24" w15:restartNumberingAfterBreak="0">
+  <w:abstractNum w:abstractNumId="25" w15:restartNumberingAfterBreak="0">
     <w:nsid w:val="4EF25FCC"/>
     <w:multiLevelType w:val="hybridMultilevel"/>
     <w:tmpl w:val="C2387DB0"/>
@@ -3963,7 +4270,7 @@
       </w:rPr>
     </w:lvl>
   </w:abstractNum>
-  <w:abstractNum w:abstractNumId="25" w15:restartNumberingAfterBreak="0">
+  <w:abstractNum w:abstractNumId="26" w15:restartNumberingAfterBreak="0">
     <w:nsid w:val="57CF6EDA"/>
     <w:multiLevelType w:val="hybridMultilevel"/>
     <w:tmpl w:val="D60AEEE0"/>
@@ -3973,7 +4280,7 @@
       <w:lvlText w:val=""/>
       <w:lvlJc w:val="left"/>
       <w:pPr>
-        <w:ind w:left="720" w:hanging="360"/>
+        <w:ind w:left="360" w:hanging="360"/>
       </w:pPr>
       <w:rPr>
         <w:rFonts w:ascii="Symbol" w:hAnsi="Symbol" w:hint="default"/>
@@ -3985,7 +4292,7 @@
       <w:lvlText w:val="o"/>
       <w:lvlJc w:val="left"/>
       <w:pPr>
-        <w:ind w:left="1440" w:hanging="360"/>
+        <w:ind w:left="1080" w:hanging="360"/>
       </w:pPr>
       <w:rPr>
         <w:rFonts w:ascii="Courier New" w:hAnsi="Courier New" w:cs="Courier New" w:hint="default"/>
@@ -3997,7 +4304,7 @@
       <w:lvlText w:val=""/>
       <w:lvlJc w:val="left"/>
       <w:pPr>
-        <w:ind w:left="2160" w:hanging="360"/>
+        <w:ind w:left="1800" w:hanging="360"/>
       </w:pPr>
       <w:rPr>
         <w:rFonts w:ascii="Wingdings" w:hAnsi="Wingdings" w:hint="default"/>
@@ -4009,7 +4316,7 @@
       <w:lvlText w:val=""/>
       <w:lvlJc w:val="left"/>
       <w:pPr>
-        <w:ind w:left="2880" w:hanging="360"/>
+        <w:ind w:left="2520" w:hanging="360"/>
       </w:pPr>
       <w:rPr>
         <w:rFonts w:ascii="Symbol" w:hAnsi="Symbol" w:hint="default"/>
@@ -4021,7 +4328,7 @@
       <w:lvlText w:val="o"/>
       <w:lvlJc w:val="left"/>
       <w:pPr>
-        <w:ind w:left="3600" w:hanging="360"/>
+        <w:ind w:left="3240" w:hanging="360"/>
       </w:pPr>
       <w:rPr>
         <w:rFonts w:ascii="Courier New" w:hAnsi="Courier New" w:cs="Courier New" w:hint="default"/>
@@ -4033,7 +4340,7 @@
       <w:lvlText w:val=""/>
       <w:lvlJc w:val="left"/>
       <w:pPr>
-        <w:ind w:left="4320" w:hanging="360"/>
+        <w:ind w:left="3960" w:hanging="360"/>
       </w:pPr>
       <w:rPr>
         <w:rFonts w:ascii="Wingdings" w:hAnsi="Wingdings" w:hint="default"/>
@@ -4045,7 +4352,7 @@
       <w:lvlText w:val=""/>
       <w:lvlJc w:val="left"/>
       <w:pPr>
-        <w:ind w:left="5040" w:hanging="360"/>
+        <w:ind w:left="4680" w:hanging="360"/>
       </w:pPr>
       <w:rPr>
         <w:rFonts w:ascii="Symbol" w:hAnsi="Symbol" w:hint="default"/>
@@ -4057,7 +4364,7 @@
       <w:lvlText w:val="o"/>
       <w:lvlJc w:val="left"/>
       <w:pPr>
-        <w:ind w:left="5760" w:hanging="360"/>
+        <w:ind w:left="5400" w:hanging="360"/>
       </w:pPr>
       <w:rPr>
         <w:rFonts w:ascii="Courier New" w:hAnsi="Courier New" w:cs="Courier New" w:hint="default"/>
@@ -4069,14 +4376,14 @@
       <w:lvlText w:val=""/>
       <w:lvlJc w:val="left"/>
       <w:pPr>
-        <w:ind w:left="6480" w:hanging="360"/>
+        <w:ind w:left="6120" w:hanging="360"/>
       </w:pPr>
       <w:rPr>
         <w:rFonts w:ascii="Wingdings" w:hAnsi="Wingdings" w:hint="default"/>
       </w:rPr>
     </w:lvl>
   </w:abstractNum>
-  <w:abstractNum w:abstractNumId="26" w15:restartNumberingAfterBreak="0">
+  <w:abstractNum w:abstractNumId="27" w15:restartNumberingAfterBreak="0">
     <w:nsid w:val="651F31BE"/>
     <w:multiLevelType w:val="hybridMultilevel"/>
     <w:tmpl w:val="0B0E5A28"/>
@@ -4189,7 +4496,7 @@
       </w:rPr>
     </w:lvl>
   </w:abstractNum>
-  <w:abstractNum w:abstractNumId="27" w15:restartNumberingAfterBreak="0">
+  <w:abstractNum w:abstractNumId="28" w15:restartNumberingAfterBreak="0">
     <w:nsid w:val="69DA1FA8"/>
     <w:multiLevelType w:val="hybridMultilevel"/>
     <w:tmpl w:val="35AA0BB6"/>
@@ -4302,7 +4609,7 @@
       </w:rPr>
     </w:lvl>
   </w:abstractNum>
-  <w:abstractNum w:abstractNumId="28" w15:restartNumberingAfterBreak="0">
+  <w:abstractNum w:abstractNumId="29" w15:restartNumberingAfterBreak="0">
     <w:nsid w:val="6F4C079F"/>
     <w:multiLevelType w:val="hybridMultilevel"/>
     <w:tmpl w:val="43EAD08E"/>
@@ -4417,7 +4724,7 @@
       </w:rPr>
     </w:lvl>
   </w:abstractNum>
-  <w:abstractNum w:abstractNumId="29" w15:restartNumberingAfterBreak="0">
+  <w:abstractNum w:abstractNumId="30" w15:restartNumberingAfterBreak="0">
     <w:nsid w:val="70A2E700"/>
     <w:multiLevelType w:val="hybridMultilevel"/>
     <w:tmpl w:val="FFFFFFFF"/>
@@ -4468,7 +4775,7 @@
       <w:lvlJc w:val="left"/>
     </w:lvl>
   </w:abstractNum>
-  <w:abstractNum w:abstractNumId="30" w15:restartNumberingAfterBreak="0">
+  <w:abstractNum w:abstractNumId="31" w15:restartNumberingAfterBreak="0">
     <w:nsid w:val="71A934C0"/>
     <w:multiLevelType w:val="hybridMultilevel"/>
     <w:tmpl w:val="D382D302"/>
@@ -4581,7 +4888,7 @@
       </w:rPr>
     </w:lvl>
   </w:abstractNum>
-  <w:abstractNum w:abstractNumId="31" w15:restartNumberingAfterBreak="0">
+  <w:abstractNum w:abstractNumId="32" w15:restartNumberingAfterBreak="0">
     <w:nsid w:val="72CB2EC7"/>
     <w:multiLevelType w:val="hybridMultilevel"/>
     <w:tmpl w:val="9F0059AA"/>
@@ -4694,7 +5001,7 @@
       </w:rPr>
     </w:lvl>
   </w:abstractNum>
-  <w:abstractNum w:abstractNumId="32" w15:restartNumberingAfterBreak="0">
+  <w:abstractNum w:abstractNumId="33" w15:restartNumberingAfterBreak="0">
     <w:nsid w:val="7B316847"/>
     <w:multiLevelType w:val="hybridMultilevel"/>
     <w:tmpl w:val="88465F7E"/>
@@ -4704,7 +5011,7 @@
       <w:lvlText w:val=""/>
       <w:lvlJc w:val="left"/>
       <w:pPr>
-        <w:ind w:left="820" w:hanging="360"/>
+        <w:ind w:left="360" w:hanging="360"/>
       </w:pPr>
       <w:rPr>
         <w:rFonts w:ascii="Symbol" w:hAnsi="Symbol" w:hint="default"/>
@@ -4716,7 +5023,7 @@
       <w:lvlText w:val="o"/>
       <w:lvlJc w:val="left"/>
       <w:pPr>
-        <w:ind w:left="1540" w:hanging="360"/>
+        <w:ind w:left="1080" w:hanging="360"/>
       </w:pPr>
       <w:rPr>
         <w:rFonts w:ascii="Courier New" w:hAnsi="Courier New" w:cs="Courier New" w:hint="default"/>
@@ -4728,7 +5035,7 @@
       <w:lvlText w:val=""/>
       <w:lvlJc w:val="left"/>
       <w:pPr>
-        <w:ind w:left="2260" w:hanging="360"/>
+        <w:ind w:left="1800" w:hanging="360"/>
       </w:pPr>
       <w:rPr>
         <w:rFonts w:ascii="Wingdings" w:hAnsi="Wingdings" w:hint="default"/>
@@ -4740,7 +5047,7 @@
       <w:lvlText w:val=""/>
       <w:lvlJc w:val="left"/>
       <w:pPr>
-        <w:ind w:left="2980" w:hanging="360"/>
+        <w:ind w:left="2520" w:hanging="360"/>
       </w:pPr>
       <w:rPr>
         <w:rFonts w:ascii="Symbol" w:hAnsi="Symbol" w:hint="default"/>
@@ -4752,7 +5059,7 @@
       <w:lvlText w:val="o"/>
       <w:lvlJc w:val="left"/>
       <w:pPr>
-        <w:ind w:left="3700" w:hanging="360"/>
+        <w:ind w:left="3240" w:hanging="360"/>
       </w:pPr>
       <w:rPr>
         <w:rFonts w:ascii="Courier New" w:hAnsi="Courier New" w:cs="Courier New" w:hint="default"/>
@@ -4764,7 +5071,7 @@
       <w:lvlText w:val=""/>
       <w:lvlJc w:val="left"/>
       <w:pPr>
-        <w:ind w:left="4420" w:hanging="360"/>
+        <w:ind w:left="3960" w:hanging="360"/>
       </w:pPr>
       <w:rPr>
         <w:rFonts w:ascii="Wingdings" w:hAnsi="Wingdings" w:hint="default"/>
@@ -4776,7 +5083,7 @@
       <w:lvlText w:val=""/>
       <w:lvlJc w:val="left"/>
       <w:pPr>
-        <w:ind w:left="5140" w:hanging="360"/>
+        <w:ind w:left="4680" w:hanging="360"/>
       </w:pPr>
       <w:rPr>
         <w:rFonts w:ascii="Symbol" w:hAnsi="Symbol" w:hint="default"/>
@@ -4788,7 +5095,7 @@
       <w:lvlText w:val="o"/>
       <w:lvlJc w:val="left"/>
       <w:pPr>
-        <w:ind w:left="5860" w:hanging="360"/>
+        <w:ind w:left="5400" w:hanging="360"/>
       </w:pPr>
       <w:rPr>
         <w:rFonts w:ascii="Courier New" w:hAnsi="Courier New" w:cs="Courier New" w:hint="default"/>
@@ -4800,14 +5107,14 @@
       <w:lvlText w:val=""/>
       <w:lvlJc w:val="left"/>
       <w:pPr>
-        <w:ind w:left="6580" w:hanging="360"/>
+        <w:ind w:left="6120" w:hanging="360"/>
       </w:pPr>
       <w:rPr>
         <w:rFonts w:ascii="Wingdings" w:hAnsi="Wingdings" w:hint="default"/>
       </w:rPr>
     </w:lvl>
   </w:abstractNum>
-  <w:abstractNum w:abstractNumId="33" w15:restartNumberingAfterBreak="0">
+  <w:abstractNum w:abstractNumId="34" w15:restartNumberingAfterBreak="0">
     <w:nsid w:val="7C5D3FF8"/>
     <w:multiLevelType w:val="hybridMultilevel"/>
     <w:tmpl w:val="9F2CE612"/>
@@ -4921,106 +5228,109 @@
     </w:lvl>
   </w:abstractNum>
   <w:num w:numId="1" w16cid:durableId="1125540736">
-    <w:abstractNumId w:val="28"/>
+    <w:abstractNumId w:val="29"/>
   </w:num>
   <w:num w:numId="2" w16cid:durableId="872308335">
-    <w:abstractNumId w:val="7"/>
+    <w:abstractNumId w:val="8"/>
   </w:num>
   <w:num w:numId="3" w16cid:durableId="613563522">
     <w:abstractNumId w:val="6"/>
   </w:num>
   <w:num w:numId="4" w16cid:durableId="1376350050">
-    <w:abstractNumId w:val="17"/>
+    <w:abstractNumId w:val="18"/>
   </w:num>
   <w:num w:numId="5" w16cid:durableId="18433394">
-    <w:abstractNumId w:val="24"/>
+    <w:abstractNumId w:val="25"/>
   </w:num>
   <w:num w:numId="6" w16cid:durableId="1121680838">
+    <w:abstractNumId w:val="10"/>
+  </w:num>
+  <w:num w:numId="7" w16cid:durableId="327024783">
     <w:abstractNumId w:val="9"/>
   </w:num>
-  <w:num w:numId="7" w16cid:durableId="327024783">
-    <w:abstractNumId w:val="8"/>
-  </w:num>
   <w:num w:numId="8" w16cid:durableId="1672102430">
-    <w:abstractNumId w:val="11"/>
+    <w:abstractNumId w:val="12"/>
   </w:num>
   <w:num w:numId="9" w16cid:durableId="1070008310">
     <w:abstractNumId w:val="4"/>
   </w:num>
   <w:num w:numId="10" w16cid:durableId="362904504">
-    <w:abstractNumId w:val="29"/>
+    <w:abstractNumId w:val="30"/>
   </w:num>
   <w:num w:numId="11" w16cid:durableId="2097628289">
-    <w:abstractNumId w:val="20"/>
+    <w:abstractNumId w:val="21"/>
   </w:num>
   <w:num w:numId="12" w16cid:durableId="1461610308">
-    <w:abstractNumId w:val="31"/>
+    <w:abstractNumId w:val="32"/>
   </w:num>
   <w:num w:numId="13" w16cid:durableId="1552888699">
-    <w:abstractNumId w:val="16"/>
+    <w:abstractNumId w:val="17"/>
   </w:num>
   <w:num w:numId="14" w16cid:durableId="435175335">
-    <w:abstractNumId w:val="12"/>
+    <w:abstractNumId w:val="13"/>
   </w:num>
   <w:num w:numId="15" w16cid:durableId="486283130">
-    <w:abstractNumId w:val="18"/>
+    <w:abstractNumId w:val="19"/>
   </w:num>
   <w:num w:numId="16" w16cid:durableId="1956869491">
+    <w:abstractNumId w:val="34"/>
+  </w:num>
+  <w:num w:numId="17" w16cid:durableId="900095692">
+    <w:abstractNumId w:val="14"/>
+  </w:num>
+  <w:num w:numId="18" w16cid:durableId="829520591">
+    <w:abstractNumId w:val="15"/>
+  </w:num>
+  <w:num w:numId="19" w16cid:durableId="750347660">
     <w:abstractNumId w:val="33"/>
   </w:num>
-  <w:num w:numId="17" w16cid:durableId="900095692">
-    <w:abstractNumId w:val="13"/>
-  </w:num>
-  <w:num w:numId="18" w16cid:durableId="829520591">
-    <w:abstractNumId w:val="14"/>
-  </w:num>
-  <w:num w:numId="19" w16cid:durableId="750347660">
-    <w:abstractNumId w:val="32"/>
-  </w:num>
   <w:num w:numId="20" w16cid:durableId="790056128">
-    <w:abstractNumId w:val="10"/>
+    <w:abstractNumId w:val="11"/>
   </w:num>
   <w:num w:numId="21" w16cid:durableId="2141993632">
-    <w:abstractNumId w:val="22"/>
+    <w:abstractNumId w:val="23"/>
   </w:num>
   <w:num w:numId="22" w16cid:durableId="566301343">
     <w:abstractNumId w:val="1"/>
   </w:num>
   <w:num w:numId="23" w16cid:durableId="1043283857">
-    <w:abstractNumId w:val="23"/>
+    <w:abstractNumId w:val="24"/>
   </w:num>
   <w:num w:numId="24" w16cid:durableId="92675406">
+    <w:abstractNumId w:val="28"/>
+  </w:num>
+  <w:num w:numId="25" w16cid:durableId="370544329">
     <w:abstractNumId w:val="27"/>
   </w:num>
-  <w:num w:numId="25" w16cid:durableId="370544329">
-    <w:abstractNumId w:val="26"/>
-  </w:num>
   <w:num w:numId="26" w16cid:durableId="1306744365">
-    <w:abstractNumId w:val="19"/>
+    <w:abstractNumId w:val="20"/>
   </w:num>
   <w:num w:numId="27" w16cid:durableId="388958629">
-    <w:abstractNumId w:val="15"/>
+    <w:abstractNumId w:val="16"/>
   </w:num>
   <w:num w:numId="28" w16cid:durableId="1714496597">
     <w:abstractNumId w:val="2"/>
   </w:num>
   <w:num w:numId="29" w16cid:durableId="1545941333">
-    <w:abstractNumId w:val="21"/>
+    <w:abstractNumId w:val="22"/>
   </w:num>
   <w:num w:numId="30" w16cid:durableId="1957715317">
     <w:abstractNumId w:val="5"/>
   </w:num>
   <w:num w:numId="31" w16cid:durableId="1352560963">
-    <w:abstractNumId w:val="30"/>
+    <w:abstractNumId w:val="31"/>
   </w:num>
   <w:num w:numId="32" w16cid:durableId="820344148">
-    <w:abstractNumId w:val="25"/>
+    <w:abstractNumId w:val="26"/>
   </w:num>
   <w:num w:numId="33" w16cid:durableId="1287271023">
     <w:abstractNumId w:val="3"/>
   </w:num>
   <w:num w:numId="34" w16cid:durableId="382412712">
     <w:abstractNumId w:val="0"/>
+  </w:num>
+  <w:num w:numId="35" w16cid:durableId="913666562">
+    <w:abstractNumId w:val="7"/>
   </w:num>
 </w:numbering>
 </file>

</xml_diff>

<commit_message>
style: improve formatting and organization in Starter and Veteran resume templates
</commit_message>
<xml_diff>
--- a/build_targets/Level_0_Starter/Starter_Resume.docx
+++ b/build_targets/Level_0_Starter/Starter_Resume.docx
@@ -28,7 +28,7 @@
       <w:pPr>
         <w:pStyle w:val="BodyText"/>
         <w:pBdr>
-          <w:bottom w:val="single" w:sz="12" w:space="1" w:color="auto"/>
+          <w:bottom w:val="single" w:sz="4" w:space="1" w:color="auto"/>
         </w:pBdr>
         <w:spacing w:line="278" w:lineRule="auto"/>
         <w:ind w:left="0" w:right="27" w:firstLine="0"/>
@@ -140,9 +140,6 @@
     </w:p>
     <w:p>
       <w:pPr>
-        <w:pBdr>
-          <w:bottom w:val="single" w:sz="12" w:space="1" w:color="auto"/>
-        </w:pBdr>
         <w:rPr>
           <w:rFonts w:ascii="Aptos" w:hAnsi="Aptos"/>
           <w:bCs/>
@@ -304,9 +301,6 @@
           <w:ilvl w:val="0"/>
           <w:numId w:val="35"/>
         </w:numPr>
-        <w:pBdr>
-          <w:bottom w:val="single" w:sz="12" w:space="1" w:color="auto"/>
-        </w:pBdr>
         <w:spacing w:line="240" w:lineRule="auto"/>
         <w:rPr>
           <w:rFonts w:ascii="Aptos" w:hAnsi="Aptos"/>
@@ -543,9 +537,6 @@
           <w:ilvl w:val="0"/>
           <w:numId w:val="20"/>
         </w:numPr>
-        <w:pBdr>
-          <w:bottom w:val="single" w:sz="12" w:space="1" w:color="auto"/>
-        </w:pBdr>
         <w:rPr>
           <w:rFonts w:ascii="Aptos" w:hAnsi="Aptos"/>
           <w:bCs/>
@@ -672,9 +663,6 @@
           <w:ilvl w:val="0"/>
           <w:numId w:val="20"/>
         </w:numPr>
-        <w:pBdr>
-          <w:bottom w:val="single" w:sz="12" w:space="1" w:color="auto"/>
-        </w:pBdr>
         <w:rPr>
           <w:rFonts w:ascii="Aptos" w:hAnsi="Aptos"/>
           <w:b/>
@@ -945,9 +933,6 @@
           <w:ilvl w:val="0"/>
           <w:numId w:val="34"/>
         </w:numPr>
-        <w:pBdr>
-          <w:bottom w:val="single" w:sz="12" w:space="1" w:color="auto"/>
-        </w:pBdr>
         <w:spacing w:before="49"/>
         <w:rPr>
           <w:rFonts w:ascii="Aptos" w:hAnsi="Aptos"/>
@@ -1073,17 +1058,7 @@
           <w:bCs w:val="0"/>
           <w:spacing w:val="-2"/>
         </w:rPr>
-        <w:t xml:space="preserve">Prioritized task execution in a high-concurrency environment, managing [Number] active tables/clients </w:t>
-      </w:r>
-      <w:r>
-        <w:rPr>
-          <w:rFonts w:ascii="Aptos" w:hAnsi="Aptos"/>
-          <w:b w:val="0"/>
-          <w:bCs w:val="0"/>
-          <w:spacing w:val="-2"/>
-        </w:rPr>
-        <w:lastRenderedPageBreak/>
-        <w:t>simultaneously</w:t>
+        <w:t>Prioritized task execution in a high-concurrency environment, managing [Number] active tables/clients simultaneously</w:t>
       </w:r>
       <w:r>
         <w:rPr>
@@ -1115,6 +1090,7 @@
           <w:b w:val="0"/>
           <w:bCs w:val="0"/>
         </w:rPr>
+        <w:lastRenderedPageBreak/>
         <w:t xml:space="preserve">Processed high-volume </w:t>
       </w:r>
       <w:r>
@@ -1241,9 +1217,6 @@
           <w:ilvl w:val="0"/>
           <w:numId w:val="30"/>
         </w:numPr>
-        <w:pBdr>
-          <w:bottom w:val="single" w:sz="12" w:space="1" w:color="auto"/>
-        </w:pBdr>
         <w:spacing w:line="240" w:lineRule="auto"/>
         <w:rPr>
           <w:rFonts w:ascii="Aptos" w:hAnsi="Aptos"/>

</xml_diff>